<commit_message>
Record the Zenodo archive: concept DOI in manuscript, README and CITATION.cff
</commit_message>
<xml_diff>
--- a/docs/ShahDialectBiasLLM.docx
+++ b/docs/ShahDialectBiasLLM.docx
@@ -8092,6 +8092,18 @@
     </w:p>
     <w:p>
       <w:pPr>
+        <w:spacing w:after="120"/>
+      </w:pPr>
+      <w:r>
+        <w:rPr>
+          <w:b w:val="0"/>
+          <w:i w:val="0"/>
+        </w:rPr>
+        <w:t>The items, the full response log, the analysis and figure code, the verification program and a record of every defect we found are available at https://github.com/Yuvansh-Shah/dialect-bias-llm and archived at https://doi.org/10.5281/zenodo.21566323.</w:t>
+      </w:r>
+    </w:p>
+    <w:p>
+      <w:pPr>
         <w:spacing w:before="240" w:after="120"/>
       </w:pPr>
       <w:r>
@@ -8112,7 +8124,7 @@
           <w:b w:val="0"/>
           <w:i w:val="0"/>
         </w:rPr>
-        <w:t>The item set, the complete unedited response log for all 936 calls, the scoring program, the analysis program and the run log are intended for public release alongside this manuscript, under the MIT Licence for code and CC BY 4.0 for data. [DATA NEEDED: repository URL and archival DOI. No repository exists at the time of writing, so no link, licence file or DOI can be verified here. Until it exists and is archived, this statement is one of intent rather than of fact and is worded that way.]</w:t>
+        <w:t>The item set, the complete unedited response log for all 936 calls, the scoring program, the analysis program, the figure code and the run log are publicly available at https://github.com/Yuvansh-Shah/dialect-bias-llm and are archived on Zenodo. Code is released under the MIT Licence and data under CC BY 4.0. The archival DOI is https://doi.org/10.5281/zenodo.21566323, which resolves to the most recent archived version; the version described in this manuscript is v1.0.0, archived at https://doi.org/10.5281/zenodo.21566324.</w:t>
       </w:r>
     </w:p>
     <w:p>
@@ -8124,7 +8136,19 @@
           <w:b w:val="0"/>
           <w:i w:val="0"/>
         </w:rPr>
-        <w:t>Every figure in this paper is produced by the analysis program from the response log. No figure has been entered by hand, and no figure has been carried over from the earlier draft.</w:t>
+        <w:t>The African American English items are third-party material from the ReDial dataset, redistributed under its MIT Licence with attribution. The NOTICE file in the repository gives the citation, the basis for that licence determination and the dataset's stated scope of use.</w:t>
+      </w:r>
+    </w:p>
+    <w:p>
+      <w:pPr>
+        <w:spacing w:after="120"/>
+      </w:pPr>
+      <w:r>
+        <w:rPr>
+          <w:b w:val="0"/>
+          <w:i w:val="0"/>
+        </w:rPr>
+        <w:t>Every figure and every number in this paper is produced by the analysis program from the response log. None has been entered by hand and none has been carried over from the earlier draft. The repository includes a verification program which recomputes the headline results directly from the raw response log, without reusing the analysis code, and which reports 92 checks. The repository also documents, in full, the five defects found during this work.</w:t>
       </w:r>
     </w:p>
     <w:p>

</xml_diff>